<commit_message>
Documentation update; CI test
</commit_message>
<xml_diff>
--- a/docs/Hoja_de_ruta_rafagas_Hito2.docx
+++ b/docs/Hoja_de_ruta_rafagas_Hito2.docx
@@ -830,7 +830,7 @@
               <w:jc w:val="center"/>
             </w:pPr>
             <w:r>
-              <w:t>☐</w:t>
+              <w:t>✅</w:t>
             </w:r>
           </w:p>
         </w:tc>
@@ -1013,7 +1013,7 @@
               <w:jc w:val="center"/>
             </w:pPr>
             <w:r>
-              <w:t>☐</w:t>
+              <w:t>✅</w:t>
             </w:r>
           </w:p>
         </w:tc>
@@ -1174,7 +1174,7 @@
               <w:jc w:val="center"/>
             </w:pPr>
             <w:r>
-              <w:t>☐</w:t>
+              <w:t>✅</w:t>
             </w:r>
           </w:p>
         </w:tc>
@@ -1325,7 +1325,7 @@
               <w:jc w:val="center"/>
             </w:pPr>
             <w:r>
-              <w:t>☐</w:t>
+              <w:t>✅</w:t>
             </w:r>
           </w:p>
         </w:tc>
@@ -1462,7 +1462,7 @@
               <w:jc w:val="center"/>
             </w:pPr>
             <w:r>
-              <w:t>☐</w:t>
+              <w:t>✅</w:t>
             </w:r>
           </w:p>
         </w:tc>
@@ -1648,7 +1648,7 @@
               <w:jc w:val="center"/>
             </w:pPr>
             <w:r>
-              <w:t>☐</w:t>
+              <w:t>✅</w:t>
             </w:r>
           </w:p>
         </w:tc>
@@ -2099,7 +2099,7 @@
               <w:jc w:val="center"/>
             </w:pPr>
             <w:r>
-              <w:t>☐</w:t>
+              <w:t>✅</w:t>
             </w:r>
           </w:p>
         </w:tc>
@@ -2267,7 +2267,7 @@
             </w:pPr>
             <w:r>
               <w:lastRenderedPageBreak/>
-              <w:t>☐</w:t>
+              <w:t>✅</w:t>
             </w:r>
           </w:p>
         </w:tc>
@@ -2428,7 +2428,7 @@
               <w:jc w:val="center"/>
             </w:pPr>
             <w:r>
-              <w:t>☐</w:t>
+              <w:t>✅</w:t>
             </w:r>
           </w:p>
         </w:tc>
@@ -2587,7 +2587,7 @@
               <w:jc w:val="center"/>
             </w:pPr>
             <w:r>
-              <w:t>☐</w:t>
+              <w:t>✅</w:t>
             </w:r>
           </w:p>
         </w:tc>
@@ -2724,7 +2724,7 @@
               <w:jc w:val="center"/>
             </w:pPr>
             <w:r>
-              <w:t>☐</w:t>
+              <w:t>✅</w:t>
             </w:r>
           </w:p>
         </w:tc>
@@ -2867,7 +2867,7 @@
               <w:jc w:val="center"/>
             </w:pPr>
             <w:r>
-              <w:t>☐</w:t>
+              <w:t>✅</w:t>
             </w:r>
           </w:p>
         </w:tc>
@@ -3036,7 +3036,7 @@
               <w:jc w:val="center"/>
             </w:pPr>
             <w:r>
-              <w:t>☐</w:t>
+              <w:t>✅</w:t>
             </w:r>
           </w:p>
         </w:tc>
@@ -3171,7 +3171,7 @@
               <w:jc w:val="center"/>
             </w:pPr>
             <w:r>
-              <w:t>☐</w:t>
+              <w:t>✅</w:t>
             </w:r>
           </w:p>
         </w:tc>
@@ -3582,7 +3582,7 @@
               <w:jc w:val="center"/>
             </w:pPr>
             <w:r>
-              <w:t>☐</w:t>
+              <w:t>✅</w:t>
             </w:r>
           </w:p>
         </w:tc>
@@ -3733,7 +3733,7 @@
               <w:jc w:val="center"/>
             </w:pPr>
             <w:r>
-              <w:t>☐</w:t>
+              <w:t>✅</w:t>
             </w:r>
           </w:p>
         </w:tc>
@@ -3871,7 +3871,7 @@
             </w:pPr>
             <w:r>
               <w:lastRenderedPageBreak/>
-              <w:t>☐</w:t>
+              <w:t>✅</w:t>
             </w:r>
           </w:p>
         </w:tc>
@@ -4022,7 +4022,7 @@
               <w:jc w:val="center"/>
             </w:pPr>
             <w:r>
-              <w:t>☐</w:t>
+              <w:t>✅</w:t>
             </w:r>
           </w:p>
         </w:tc>
@@ -4385,7 +4385,7 @@
               <w:jc w:val="center"/>
             </w:pPr>
             <w:r>
-              <w:t>☐</w:t>
+              <w:t>✅</w:t>
             </w:r>
           </w:p>
         </w:tc>
@@ -4931,6 +4931,49 @@
       <w:proofErr w:type="spellEnd"/>
       <w:r>
         <w:t>.</w:t>
+      </w:r>
+    </w:p>
+    <w:p>
+      <w:r>
+        <w:t xml:space="preserve"/>
+      </w:r>
+    </w:p>
+    <w:p>
+      <w:r>
+        <w:rPr>
+          <w:b/>
+        </w:rPr>
+        <w:t xml:space="preserve">NOTA DE ESTADO - auditoria de documentacion, 2026-08-04</w:t>
+      </w:r>
+    </w:p>
+    <w:p>
+      <w:r>
+        <w:t xml:space="preserve">Leyenda: ✅ = hecho y verificado contra el codigo.</w:t>
+      </w:r>
+    </w:p>
+    <w:p>
+      <w:r>
+        <w:t xml:space="preserve">HITO 2 COMPLETO: las 19 rafagas estan hechas. Verificacion: RT.1 -&gt; docs/estrategia-testing.md; RT.2-RT.4 -&gt; suites en apps/api/test/ (auth, listings, search, messaging); RT.5 -&gt; .github/workflows/ci.yml, job "E2E Tests" con Postgres/Redis/Meilisearch como service containers; RT.6 -&gt; nestjs-pino + pino-http en apps/api/package.json y Sentry inicializado en main.ts y en los 6 processors de BullMQ.</w:t>
+      </w:r>
+    </w:p>
+    <w:p>
+      <w:r>
+        <w:t xml:space="preserve">R7.1-R7.8 -&gt; modulos apps/api/src/modules/admin y /moderation operativos (AuditLog, Setting, BadWordService, RolesGuard) y el backoffice en apps/web/src/app/(admin), hoy con 18 secciones.</w:t>
+      </w:r>
+    </w:p>
+    <w:p>
+      <w:r>
+        <w:t xml:space="preserve">RB.1-RB.4 -&gt; docs/diseno-blog.md y el modulo apps/api/src/modules/blog. AVISO: el modelo del blog evoluciono despues (body Markdown -&gt; blocks Json con 13 tipos de bloque); diseno-blog.md quedo desfasado y se reescribe aparte.</w:t>
+      </w:r>
+    </w:p>
+    <w:p>
+      <w:r>
+        <w:t xml:space="preserve">RF.1 -&gt; docs/diseno-facturacion.md (hoy en revision 3).</w:t>
+      </w:r>
+    </w:p>
+    <w:p>
+      <w:r>
+        <w:t xml:space="preserve">Estado real implementado: docs/estado-tecnico.md. Plan vigente: docs/Hoja_de_ruta_rafagas_Hito5-9.docx.</w:t>
       </w:r>
     </w:p>
     <w:sectPr>

</xml_diff>